<commit_message>
Revisão do Passo 0/1: GUT sem bug, fatia ativa e mapeamento na constituição
Corrige diagnóstico anterior: gut_plugin.gd carrega gut_menu.gd por
load() explícito; menu_manager.gd.uid é resíduo órfão sem
referências, não um bug de empacotamento. Ativa o plugin GUT em
game/project.godot; confirmado sem erros no editor headless e nos
testes via CLI.

Corrige docs/fluxo-sdd.md: a fatia ativa é lida de
.specify/feature.json (ou SPECIFY_FEATURE_DIRECTORY) na v1.0.x, não
de SPECIFY_FEATURE; documenta o procedimento real de instalação do
GUT. Adiciona a tabela de mapeamento de entrada à constituição
(item 2.4, única alteração autorizada). Registra as duas revisões
em docs/review/. Regenera a apostila.

Co-Authored-By: Claude Sonnet 5 <noreply@anthropic.com>
</commit_message>
<xml_diff>
--- a/docs/apostila-sdd-ze-peixeira.docx
+++ b/docs/apostila-sdd-ze-peixeira.docx
@@ -1898,7 +1898,7 @@
             <w:pPr>
               <w:spacing w:after="0" w:before="0" w:line="270"/>
             </w:pPr>
-            <w:hyperlink w:history="1" r:id="rIdb-5ki5cdzc_egzydopatb">
+            <w:hyperlink w:history="1" r:id="rIdnxhuebkvv4sm2mxkm3kxl">
               <w:r>
                 <w:rPr>
                   <w:rStyle w:val="Hyperlink"/>
@@ -2308,7 +2308,7 @@
               </w:rPr>
               <w:t xml:space="preserve">Servidor MCP para Godot (ex.: </w:t>
             </w:r>
-            <w:hyperlink w:history="1" r:id="rId0nghpdhx4yvixwaijfybc">
+            <w:hyperlink w:history="1" r:id="rIdevqgfy9z_iki2dlnclwbl">
               <w:r>
                 <w:rPr>
                   <w:rStyle w:val="Hyperlink"/>
@@ -2597,7 +2597,7 @@
           <w:sz w:val="20"/>
           <w:szCs w:val="20"/>
         </w:rPr>
-        <w:t xml:space="preserve"> Versões usadas: Godot ___ · Spec Kit ___ · GUT ___ · agente ___ (modelo ___).</w:t>
+        <w:t xml:space="preserve"> Versões usadas: Godot 4.7.2.stable.official · Spec Kit 1.0.10 · GUT 9.7.1 · agente Claude Code (modelo Sonnet 5).</w:t>
       </w:r>
     </w:p>
     <w:p>
@@ -2747,7 +2747,70 @@
         <w:t xml:space="preserve">game/</w:t>
       </w:r>
       <w:r>
-        <w:t xml:space="preserve"> e instalar o GUT pelo AssetLib.</w:t>
+        <w:t xml:space="preserve"> e instalar o GUT. Pelo AssetLib funciona dentro do editor; na execução real desta demonstração, sem editor gráfico disponível, o addon foi obtido direto do repositório oficial, fixando a versão:</w:t>
+      </w:r>
+    </w:p>
+    <w:p>
+      <w:pPr>
+        <w:keepNext/>
+        <w:keepLines/>
+        <w:pBdr>
+          <w:left w:val="single" w:color="7A1F2B" w:sz="18" w:space="8"/>
+        </w:pBdr>
+        <w:shd w:fill="F4F1EC" w:color="auto" w:val="clear"/>
+        <w:spacing w:after="0" w:before="120" w:line="260"/>
+        <w:ind w:left="200" w:right="200"/>
+      </w:pPr>
+      <w:r>
+        <w:rPr>
+          <w:rFonts w:ascii="Consolas" w:cs="Consolas" w:eastAsia="Consolas" w:hAnsi="Consolas"/>
+          <w:color w:val="1F1F1F"/>
+          <w:sz w:val="18"/>
+          <w:szCs w:val="18"/>
+        </w:rPr>
+        <w:t xml:space="preserve">git clone --depth 1 --branch v9.7.1 https://github.com/bitwes/Gut.git /tmp/gut-src</w:t>
+      </w:r>
+    </w:p>
+    <w:p>
+      <w:pPr>
+        <w:keepNext/>
+        <w:keepLines/>
+        <w:pBdr>
+          <w:left w:val="single" w:color="7A1F2B" w:sz="18" w:space="8"/>
+        </w:pBdr>
+        <w:shd w:fill="F4F1EC" w:color="auto" w:val="clear"/>
+        <w:spacing w:after="0" w:before="0" w:line="260"/>
+        <w:ind w:left="200" w:right="200"/>
+      </w:pPr>
+      <w:r>
+        <w:rPr>
+          <w:rFonts w:ascii="Consolas" w:cs="Consolas" w:eastAsia="Consolas" w:hAnsi="Consolas"/>
+          <w:color w:val="1F1F1F"/>
+          <w:sz w:val="18"/>
+          <w:szCs w:val="18"/>
+        </w:rPr>
+        <w:t xml:space="preserve">cp -R /tmp/gut-src/addons/gut game/addons/gut</w:t>
+      </w:r>
+    </w:p>
+    <w:p>
+      <w:pPr>
+        <w:keepNext w:val="false"/>
+        <w:keepLines/>
+        <w:pBdr>
+          <w:left w:val="single" w:color="7A1F2B" w:sz="18" w:space="8"/>
+        </w:pBdr>
+        <w:shd w:fill="F4F1EC" w:color="auto" w:val="clear"/>
+        <w:spacing w:after="160" w:before="0" w:line="260"/>
+        <w:ind w:left="200" w:right="200"/>
+      </w:pPr>
+      <w:r>
+        <w:rPr>
+          <w:rFonts w:ascii="Consolas" w:cs="Consolas" w:eastAsia="Consolas" w:hAnsi="Consolas"/>
+          <w:color w:val="1F1F1F"/>
+          <w:sz w:val="18"/>
+          <w:szCs w:val="18"/>
+        </w:rPr>
+        <w:t xml:space="preserve">rm -rf /tmp/gut-src</w:t>
       </w:r>
     </w:p>
     <w:p>
@@ -2756,34 +2819,53 @@
         <w:jc w:val="both"/>
       </w:pPr>
       <w:r>
+        <w:t xml:space="preserve">Depois, ativar o plugin em </w:t>
+      </w:r>
+      <w:r>
         <w:rPr>
           <w:b/>
           <w:bCs/>
         </w:rPr>
-        <w:t xml:space="preserve">Conferir:</w:t>
-      </w:r>
-      <w:r>
-        <w:t xml:space="preserve"> </w:t>
-      </w:r>
-      <w:r>
-        <w:rPr>
-          <w:rFonts w:ascii="Consolas" w:cs="Consolas" w:eastAsia="Consolas" w:hAnsi="Consolas"/>
-          <w:color w:val="7A1F2B"/>
-          <w:sz w:val="19"/>
-          <w:szCs w:val="19"/>
-        </w:rPr>
-        <w:t xml:space="preserve">git status</w:t>
-      </w:r>
-      <w:r>
-        <w:t xml:space="preserve"> mostra só arquivos do Spec Kit e do projeto Godot. Fazer o commit desse estado inicial antes de qualquer código gerado.</w:t>
-      </w:r>
-    </w:p>
-    <w:p>
-      <w:pPr>
-        <w:pStyle w:val="Heading3"/>
-      </w:pPr>
-      <w:r>
-        <w:t xml:space="preserve">Passo 2 — Constituição</w:t>
+        <w:t xml:space="preserve">Project &gt; Project Settings &gt; Plugins</w:t>
+      </w:r>
+      <w:r>
+        <w:t xml:space="preserve"> (ou, direto no </w:t>
+      </w:r>
+      <w:r>
+        <w:rPr>
+          <w:rFonts w:ascii="Consolas" w:cs="Consolas" w:eastAsia="Consolas" w:hAnsi="Consolas"/>
+          <w:color w:val="7A1F2B"/>
+          <w:sz w:val="19"/>
+          <w:szCs w:val="19"/>
+        </w:rPr>
+        <w:t xml:space="preserve">project.godot</w:t>
+      </w:r>
+      <w:r>
+        <w:t xml:space="preserve">, </w:t>
+      </w:r>
+      <w:r>
+        <w:rPr>
+          <w:rFonts w:ascii="Consolas" w:cs="Consolas" w:eastAsia="Consolas" w:hAnsi="Consolas"/>
+          <w:color w:val="7A1F2B"/>
+          <w:sz w:val="19"/>
+          <w:szCs w:val="19"/>
+        </w:rPr>
+        <w:t xml:space="preserve">[editor_plugins] enabled=PackedStringArray("res://addons/gut/plugin.cfg")</w:t>
+      </w:r>
+      <w:r>
+        <w:t xml:space="preserve">) e rodar </w:t>
+      </w:r>
+      <w:r>
+        <w:rPr>
+          <w:rFonts w:ascii="Consolas" w:cs="Consolas" w:eastAsia="Consolas" w:hAnsi="Consolas"/>
+          <w:color w:val="7A1F2B"/>
+          <w:sz w:val="19"/>
+          <w:szCs w:val="19"/>
+        </w:rPr>
+        <w:t xml:space="preserve">godot --headless --path game --import</w:t>
+      </w:r>
+      <w:r>
+        <w:t xml:space="preserve"> uma vez para registrar as classes globais do GUT.</w:t>
       </w:r>
     </w:p>
     <w:p>
@@ -2792,7 +2874,34 @@
         <w:jc w:val="both"/>
       </w:pPr>
       <w:r>
-        <w:t xml:space="preserve">A constituição é escrita pelo humano; o agente não a altera. Ela fixa o que vale para todas as fatias: versão do motor, APIs proibidas, arquitetura, convenções de nomes, como testar, o contrato dos placeholders e os padrões do Nystrom que devem aparecer.</w:t>
+        <w:rPr>
+          <w:b/>
+          <w:bCs/>
+        </w:rPr>
+        <w:t xml:space="preserve">Conferir:</w:t>
+      </w:r>
+      <w:r>
+        <w:t xml:space="preserve"> </w:t>
+      </w:r>
+      <w:r>
+        <w:rPr>
+          <w:rFonts w:ascii="Consolas" w:cs="Consolas" w:eastAsia="Consolas" w:hAnsi="Consolas"/>
+          <w:color w:val="7A1F2B"/>
+          <w:sz w:val="19"/>
+          <w:szCs w:val="19"/>
+        </w:rPr>
+        <w:t xml:space="preserve">git status</w:t>
+      </w:r>
+      <w:r>
+        <w:t xml:space="preserve"> mostra só arquivos do Spec Kit e do projeto Godot. Fazer o commit desse estado inicial antes de qualquer código gerado.</w:t>
+      </w:r>
+    </w:p>
+    <w:p>
+      <w:pPr>
+        <w:pStyle w:val="Heading3"/>
+      </w:pPr>
+      <w:r>
+        <w:t xml:space="preserve">Passo 2 — Constituição</w:t>
       </w:r>
     </w:p>
     <w:p>
@@ -2801,6 +2910,15 @@
         <w:jc w:val="both"/>
       </w:pPr>
       <w:r>
+        <w:t xml:space="preserve">A constituição é escrita pelo humano; o agente não a altera. Ela fixa o que vale para todas as fatias: versão do motor, APIs proibidas, arquitetura, convenções de nomes, como testar, o contrato dos placeholders e os padrões do Nystrom que devem aparecer.</w:t>
+      </w:r>
+    </w:p>
+    <w:p>
+      <w:pPr>
+        <w:spacing w:after="140" w:before="60" w:line="312"/>
+        <w:jc w:val="both"/>
+      </w:pPr>
+      <w:r>
         <w:t xml:space="preserve">Com o comando </w:t>
       </w:r>
       <w:r>
@@ -2899,7 +3017,91 @@
         <w:t xml:space="preserve">antes de abrir o agente</w:t>
       </w:r>
       <w:r>
-        <w:t xml:space="preserve">:</w:t>
+        <w:t xml:space="preserve">. Desde a v1.0.x, a fatia ativa é lida de </w:t>
+      </w:r>
+      <w:r>
+        <w:rPr>
+          <w:rFonts w:ascii="Consolas" w:cs="Consolas" w:eastAsia="Consolas" w:hAnsi="Consolas"/>
+          <w:color w:val="7A1F2B"/>
+          <w:sz w:val="19"/>
+          <w:szCs w:val="19"/>
+        </w:rPr>
+        <w:t xml:space="preserve">.specify/feature.json</w:t>
+      </w:r>
+      <w:r>
+        <w:t xml:space="preserve"> (chave </w:t>
+      </w:r>
+      <w:r>
+        <w:rPr>
+          <w:rFonts w:ascii="Consolas" w:cs="Consolas" w:eastAsia="Consolas" w:hAnsi="Consolas"/>
+          <w:color w:val="7A1F2B"/>
+          <w:sz w:val="19"/>
+          <w:szCs w:val="19"/>
+        </w:rPr>
+        <w:t xml:space="preserve">feature_directory</w:t>
+      </w:r>
+      <w:r>
+        <w:t xml:space="preserve">) ou da variável de ambiente </w:t>
+      </w:r>
+      <w:r>
+        <w:rPr>
+          <w:rFonts w:ascii="Consolas" w:cs="Consolas" w:eastAsia="Consolas" w:hAnsi="Consolas"/>
+          <w:color w:val="7A1F2B"/>
+          <w:sz w:val="19"/>
+          <w:szCs w:val="19"/>
+        </w:rPr>
+        <w:t xml:space="preserve">SPECIFY_FEATURE_DIRECTORY</w:t>
+      </w:r>
+      <w:r>
+        <w:t xml:space="preserve"> — não de </w:t>
+      </w:r>
+      <w:r>
+        <w:rPr>
+          <w:rFonts w:ascii="Consolas" w:cs="Consolas" w:eastAsia="Consolas" w:hAnsi="Consolas"/>
+          <w:color w:val="7A1F2B"/>
+          <w:sz w:val="19"/>
+          <w:szCs w:val="19"/>
+        </w:rPr>
+        <w:t xml:space="preserve">SPECIFY_FEATURE</w:t>
+      </w:r>
+      <w:r>
+        <w:t xml:space="preserve">, que só rotula a saída de alguns comandos e não seleciona nada (ver </w:t>
+      </w:r>
+      <w:r>
+        <w:rPr>
+          <w:rFonts w:ascii="Consolas" w:cs="Consolas" w:eastAsia="Consolas" w:hAnsi="Consolas"/>
+          <w:color w:val="7A1F2B"/>
+          <w:sz w:val="19"/>
+          <w:szCs w:val="19"/>
+        </w:rPr>
+        <w:t xml:space="preserve">.specify/scripts/bash/common.sh</w:t>
+      </w:r>
+      <w:r>
+        <w:t xml:space="preserve">, funções </w:t>
+      </w:r>
+      <w:r>
+        <w:rPr>
+          <w:rFonts w:ascii="Consolas" w:cs="Consolas" w:eastAsia="Consolas" w:hAnsi="Consolas"/>
+          <w:color w:val="7A1F2B"/>
+          <w:sz w:val="19"/>
+          <w:szCs w:val="19"/>
+        </w:rPr>
+        <w:t xml:space="preserve">get_current_branch</w:t>
+      </w:r>
+      <w:r>
+        <w:t xml:space="preserve"> e </w:t>
+      </w:r>
+      <w:r>
+        <w:rPr>
+          <w:rFonts w:ascii="Consolas" w:cs="Consolas" w:eastAsia="Consolas" w:hAnsi="Consolas"/>
+          <w:color w:val="7A1F2B"/>
+          <w:sz w:val="19"/>
+          <w:szCs w:val="19"/>
+        </w:rPr>
+        <w:t xml:space="preserve">get_feature_paths</w:t>
+      </w:r>
+      <w:r>
+        <w:t xml:space="preserve">):</w:t>
       </w:r>
     </w:p>
     <w:p>
@@ -2920,7 +3122,7 @@
           <w:sz w:val="18"/>
           <w:szCs w:val="18"/>
         </w:rPr>
-        <w:t xml:space="preserve">export SPECIFY_FEATURE=001-movimento</w:t>
+        <w:t xml:space="preserve">echo '{"feature_directory":"specs/001-movimento"}' &gt; .specify/feature.json</w:t>
       </w:r>
     </w:p>
     <w:p>
@@ -3724,7 +3926,7 @@
           <w:sz w:val="18"/>
           <w:szCs w:val="18"/>
         </w:rPr>
-        <w:t xml:space="preserve">export SPECIFY_FEATURE=002-pulo</w:t>
+        <w:t xml:space="preserve">echo '{"feature_directory":"specs/002-pulo"}' &gt; .specify/feature.json</w:t>
       </w:r>
     </w:p>
     <w:p>
@@ -7209,8 +7411,896 @@
         <w:t xml:space="preserve">cortar</w:t>
       </w:r>
       <w:r>
-        <w:t xml:space="preserve">. Teclas ou botões diretos no código são proibidos. Cada ação tem mapeamento de teclado e de controle.</w:t>
-      </w:r>
+        <w:t xml:space="preserve">. Teclas ou botões diretos no código são proibidos. Cada ação tem mapeamento de teclado e de controle, conforme a tabela abaixo (definida em </w:t>
+      </w:r>
+      <w:r>
+        <w:rPr>
+          <w:rFonts w:ascii="Consolas" w:cs="Consolas" w:eastAsia="Consolas" w:hAnsi="Consolas"/>
+          <w:color w:val="7A1F2B"/>
+          <w:sz w:val="19"/>
+          <w:szCs w:val="19"/>
+        </w:rPr>
+        <w:t xml:space="preserve">game/project.godot</w:t>
+      </w:r>
+      <w:r>
+        <w:t xml:space="preserve">):</w:t>
+      </w:r>
+    </w:p>
+    <w:tbl>
+      <w:tblPr>
+        <w:tblW w:type="dxa" w:w="9638"/>
+        <w:tblBorders>
+          <w:top w:val="single" w:color="auto" w:sz="4"/>
+          <w:left w:val="single" w:color="auto" w:sz="4"/>
+          <w:bottom w:val="single" w:color="auto" w:sz="4"/>
+          <w:right w:val="single" w:color="auto" w:sz="4"/>
+          <w:insideH w:val="single" w:color="auto" w:sz="4"/>
+          <w:insideV w:val="single" w:color="auto" w:sz="4"/>
+        </w:tblBorders>
+      </w:tblPr>
+      <w:tblGrid>
+        <w:gridCol w:w="2998"/>
+        <w:gridCol w:w="2784"/>
+        <w:gridCol w:w="3856"/>
+      </w:tblGrid>
+      <w:tr>
+        <w:trPr>
+          <w:tblHeader/>
+        </w:trPr>
+        <w:tc>
+          <w:tcPr>
+            <w:tcW w:type="dxa" w:w="2998"/>
+            <w:tcBorders>
+              <w:top w:val="single" w:color="C9C2B8" w:sz="4"/>
+              <w:left w:val="single" w:color="C9C2B8" w:sz="4"/>
+              <w:bottom w:val="single" w:color="C9C2B8" w:sz="4"/>
+              <w:right w:val="single" w:color="C9C2B8" w:sz="4"/>
+            </w:tcBorders>
+            <w:shd w:fill="EFE9E1" w:color="auto" w:val="clear"/>
+            <w:tcMar>
+              <w:top w:type="dxa" w:w="60"/>
+              <w:left w:type="dxa" w:w="100"/>
+              <w:bottom w:type="dxa" w:w="60"/>
+              <w:right w:type="dxa" w:w="100"/>
+            </w:tcMar>
+          </w:tcPr>
+          <w:p>
+            <w:pPr>
+              <w:spacing w:after="0" w:before="0" w:line="270"/>
+            </w:pPr>
+            <w:r>
+              <w:rPr>
+                <w:b/>
+                <w:bCs/>
+                <w:sz w:val="19"/>
+                <w:szCs w:val="19"/>
+              </w:rPr>
+              <w:t xml:space="preserve">Ação</w:t>
+            </w:r>
+          </w:p>
+        </w:tc>
+        <w:tc>
+          <w:tcPr>
+            <w:tcW w:type="dxa" w:w="2784"/>
+            <w:tcBorders>
+              <w:top w:val="single" w:color="C9C2B8" w:sz="4"/>
+              <w:left w:val="single" w:color="C9C2B8" w:sz="4"/>
+              <w:bottom w:val="single" w:color="C9C2B8" w:sz="4"/>
+              <w:right w:val="single" w:color="C9C2B8" w:sz="4"/>
+            </w:tcBorders>
+            <w:shd w:fill="EFE9E1" w:color="auto" w:val="clear"/>
+            <w:tcMar>
+              <w:top w:type="dxa" w:w="60"/>
+              <w:left w:type="dxa" w:w="100"/>
+              <w:bottom w:type="dxa" w:w="60"/>
+              <w:right w:type="dxa" w:w="100"/>
+            </w:tcMar>
+          </w:tcPr>
+          <w:p>
+            <w:pPr>
+              <w:spacing w:after="0" w:before="0" w:line="270"/>
+            </w:pPr>
+            <w:r>
+              <w:rPr>
+                <w:b/>
+                <w:bCs/>
+                <w:sz w:val="19"/>
+                <w:szCs w:val="19"/>
+              </w:rPr>
+              <w:t xml:space="preserve">Teclado</w:t>
+            </w:r>
+          </w:p>
+        </w:tc>
+        <w:tc>
+          <w:tcPr>
+            <w:tcW w:type="dxa" w:w="3856"/>
+            <w:tcBorders>
+              <w:top w:val="single" w:color="C9C2B8" w:sz="4"/>
+              <w:left w:val="single" w:color="C9C2B8" w:sz="4"/>
+              <w:bottom w:val="single" w:color="C9C2B8" w:sz="4"/>
+              <w:right w:val="single" w:color="C9C2B8" w:sz="4"/>
+            </w:tcBorders>
+            <w:shd w:fill="EFE9E1" w:color="auto" w:val="clear"/>
+            <w:tcMar>
+              <w:top w:type="dxa" w:w="60"/>
+              <w:left w:type="dxa" w:w="100"/>
+              <w:bottom w:type="dxa" w:w="60"/>
+              <w:right w:type="dxa" w:w="100"/>
+            </w:tcMar>
+          </w:tcPr>
+          <w:p>
+            <w:pPr>
+              <w:spacing w:after="0" w:before="0" w:line="270"/>
+            </w:pPr>
+            <w:r>
+              <w:rPr>
+                <w:b/>
+                <w:bCs/>
+                <w:sz w:val="19"/>
+                <w:szCs w:val="19"/>
+              </w:rPr>
+              <w:t xml:space="preserve">Controle</w:t>
+            </w:r>
+          </w:p>
+        </w:tc>
+      </w:tr>
+      <w:tr>
+        <w:trPr>
+          <w:cantSplit/>
+        </w:trPr>
+        <w:tc>
+          <w:tcPr>
+            <w:tcW w:type="dxa" w:w="2998"/>
+            <w:tcBorders>
+              <w:top w:val="single" w:color="C9C2B8" w:sz="4"/>
+              <w:left w:val="single" w:color="C9C2B8" w:sz="4"/>
+              <w:bottom w:val="single" w:color="C9C2B8" w:sz="4"/>
+              <w:right w:val="single" w:color="C9C2B8" w:sz="4"/>
+            </w:tcBorders>
+            <w:tcMar>
+              <w:top w:type="dxa" w:w="60"/>
+              <w:left w:type="dxa" w:w="100"/>
+              <w:bottom w:type="dxa" w:w="60"/>
+              <w:right w:type="dxa" w:w="100"/>
+            </w:tcMar>
+          </w:tcPr>
+          <w:p>
+            <w:pPr>
+              <w:spacing w:after="0" w:before="0" w:line="270"/>
+            </w:pPr>
+            <w:r>
+              <w:rPr>
+                <w:rFonts w:ascii="Consolas" w:cs="Consolas" w:eastAsia="Consolas" w:hAnsi="Consolas"/>
+                <w:color w:val="7A1F2B"/>
+                <w:sz w:val="17"/>
+                <w:szCs w:val="17"/>
+              </w:rPr>
+              <w:t xml:space="preserve">mover_esquerda</w:t>
+            </w:r>
+          </w:p>
+        </w:tc>
+        <w:tc>
+          <w:tcPr>
+            <w:tcW w:type="dxa" w:w="2784"/>
+            <w:tcBorders>
+              <w:top w:val="single" w:color="C9C2B8" w:sz="4"/>
+              <w:left w:val="single" w:color="C9C2B8" w:sz="4"/>
+              <w:bottom w:val="single" w:color="C9C2B8" w:sz="4"/>
+              <w:right w:val="single" w:color="C9C2B8" w:sz="4"/>
+            </w:tcBorders>
+            <w:tcMar>
+              <w:top w:type="dxa" w:w="60"/>
+              <w:left w:type="dxa" w:w="100"/>
+              <w:bottom w:type="dxa" w:w="60"/>
+              <w:right w:type="dxa" w:w="100"/>
+            </w:tcMar>
+          </w:tcPr>
+          <w:p>
+            <w:pPr>
+              <w:spacing w:after="0" w:before="0" w:line="270"/>
+            </w:pPr>
+            <w:r>
+              <w:rPr>
+                <w:sz w:val="19"/>
+                <w:szCs w:val="19"/>
+              </w:rPr>
+              <w:t xml:space="preserve">Seta esquerda</w:t>
+            </w:r>
+          </w:p>
+        </w:tc>
+        <w:tc>
+          <w:tcPr>
+            <w:tcW w:type="dxa" w:w="3856"/>
+            <w:tcBorders>
+              <w:top w:val="single" w:color="C9C2B8" w:sz="4"/>
+              <w:left w:val="single" w:color="C9C2B8" w:sz="4"/>
+              <w:bottom w:val="single" w:color="C9C2B8" w:sz="4"/>
+              <w:right w:val="single" w:color="C9C2B8" w:sz="4"/>
+            </w:tcBorders>
+            <w:tcMar>
+              <w:top w:type="dxa" w:w="60"/>
+              <w:left w:type="dxa" w:w="100"/>
+              <w:bottom w:type="dxa" w:w="60"/>
+              <w:right w:type="dxa" w:w="100"/>
+            </w:tcMar>
+          </w:tcPr>
+          <w:p>
+            <w:pPr>
+              <w:spacing w:after="0" w:before="0" w:line="270"/>
+            </w:pPr>
+            <w:r>
+              <w:rPr>
+                <w:sz w:val="19"/>
+                <w:szCs w:val="19"/>
+              </w:rPr>
+              <w:t xml:space="preserve">D-pad esquerda</w:t>
+            </w:r>
+          </w:p>
+        </w:tc>
+      </w:tr>
+      <w:tr>
+        <w:trPr>
+          <w:cantSplit/>
+        </w:trPr>
+        <w:tc>
+          <w:tcPr>
+            <w:tcW w:type="dxa" w:w="2998"/>
+            <w:tcBorders>
+              <w:top w:val="single" w:color="C9C2B8" w:sz="4"/>
+              <w:left w:val="single" w:color="C9C2B8" w:sz="4"/>
+              <w:bottom w:val="single" w:color="C9C2B8" w:sz="4"/>
+              <w:right w:val="single" w:color="C9C2B8" w:sz="4"/>
+            </w:tcBorders>
+            <w:tcMar>
+              <w:top w:type="dxa" w:w="60"/>
+              <w:left w:type="dxa" w:w="100"/>
+              <w:bottom w:type="dxa" w:w="60"/>
+              <w:right w:type="dxa" w:w="100"/>
+            </w:tcMar>
+          </w:tcPr>
+          <w:p>
+            <w:pPr>
+              <w:spacing w:after="0" w:before="0" w:line="270"/>
+            </w:pPr>
+            <w:r>
+              <w:rPr>
+                <w:rFonts w:ascii="Consolas" w:cs="Consolas" w:eastAsia="Consolas" w:hAnsi="Consolas"/>
+                <w:color w:val="7A1F2B"/>
+                <w:sz w:val="17"/>
+                <w:szCs w:val="17"/>
+              </w:rPr>
+              <w:t xml:space="preserve">mover_direita</w:t>
+            </w:r>
+          </w:p>
+        </w:tc>
+        <w:tc>
+          <w:tcPr>
+            <w:tcW w:type="dxa" w:w="2784"/>
+            <w:tcBorders>
+              <w:top w:val="single" w:color="C9C2B8" w:sz="4"/>
+              <w:left w:val="single" w:color="C9C2B8" w:sz="4"/>
+              <w:bottom w:val="single" w:color="C9C2B8" w:sz="4"/>
+              <w:right w:val="single" w:color="C9C2B8" w:sz="4"/>
+            </w:tcBorders>
+            <w:tcMar>
+              <w:top w:type="dxa" w:w="60"/>
+              <w:left w:type="dxa" w:w="100"/>
+              <w:bottom w:type="dxa" w:w="60"/>
+              <w:right w:type="dxa" w:w="100"/>
+            </w:tcMar>
+          </w:tcPr>
+          <w:p>
+            <w:pPr>
+              <w:spacing w:after="0" w:before="0" w:line="270"/>
+            </w:pPr>
+            <w:r>
+              <w:rPr>
+                <w:sz w:val="19"/>
+                <w:szCs w:val="19"/>
+              </w:rPr>
+              <w:t xml:space="preserve">Seta direita</w:t>
+            </w:r>
+          </w:p>
+        </w:tc>
+        <w:tc>
+          <w:tcPr>
+            <w:tcW w:type="dxa" w:w="3856"/>
+            <w:tcBorders>
+              <w:top w:val="single" w:color="C9C2B8" w:sz="4"/>
+              <w:left w:val="single" w:color="C9C2B8" w:sz="4"/>
+              <w:bottom w:val="single" w:color="C9C2B8" w:sz="4"/>
+              <w:right w:val="single" w:color="C9C2B8" w:sz="4"/>
+            </w:tcBorders>
+            <w:tcMar>
+              <w:top w:type="dxa" w:w="60"/>
+              <w:left w:type="dxa" w:w="100"/>
+              <w:bottom w:type="dxa" w:w="60"/>
+              <w:right w:type="dxa" w:w="100"/>
+            </w:tcMar>
+          </w:tcPr>
+          <w:p>
+            <w:pPr>
+              <w:spacing w:after="0" w:before="0" w:line="270"/>
+            </w:pPr>
+            <w:r>
+              <w:rPr>
+                <w:sz w:val="19"/>
+                <w:szCs w:val="19"/>
+              </w:rPr>
+              <w:t xml:space="preserve">D-pad direita</w:t>
+            </w:r>
+          </w:p>
+        </w:tc>
+      </w:tr>
+      <w:tr>
+        <w:trPr>
+          <w:cantSplit/>
+        </w:trPr>
+        <w:tc>
+          <w:tcPr>
+            <w:tcW w:type="dxa" w:w="2998"/>
+            <w:tcBorders>
+              <w:top w:val="single" w:color="C9C2B8" w:sz="4"/>
+              <w:left w:val="single" w:color="C9C2B8" w:sz="4"/>
+              <w:bottom w:val="single" w:color="C9C2B8" w:sz="4"/>
+              <w:right w:val="single" w:color="C9C2B8" w:sz="4"/>
+            </w:tcBorders>
+            <w:tcMar>
+              <w:top w:type="dxa" w:w="60"/>
+              <w:left w:type="dxa" w:w="100"/>
+              <w:bottom w:type="dxa" w:w="60"/>
+              <w:right w:type="dxa" w:w="100"/>
+            </w:tcMar>
+          </w:tcPr>
+          <w:p>
+            <w:pPr>
+              <w:spacing w:after="0" w:before="0" w:line="270"/>
+            </w:pPr>
+            <w:r>
+              <w:rPr>
+                <w:rFonts w:ascii="Consolas" w:cs="Consolas" w:eastAsia="Consolas" w:hAnsi="Consolas"/>
+                <w:color w:val="7A1F2B"/>
+                <w:sz w:val="17"/>
+                <w:szCs w:val="17"/>
+              </w:rPr>
+              <w:t xml:space="preserve">mover_cima</w:t>
+            </w:r>
+          </w:p>
+        </w:tc>
+        <w:tc>
+          <w:tcPr>
+            <w:tcW w:type="dxa" w:w="2784"/>
+            <w:tcBorders>
+              <w:top w:val="single" w:color="C9C2B8" w:sz="4"/>
+              <w:left w:val="single" w:color="C9C2B8" w:sz="4"/>
+              <w:bottom w:val="single" w:color="C9C2B8" w:sz="4"/>
+              <w:right w:val="single" w:color="C9C2B8" w:sz="4"/>
+            </w:tcBorders>
+            <w:tcMar>
+              <w:top w:type="dxa" w:w="60"/>
+              <w:left w:type="dxa" w:w="100"/>
+              <w:bottom w:type="dxa" w:w="60"/>
+              <w:right w:type="dxa" w:w="100"/>
+            </w:tcMar>
+          </w:tcPr>
+          <w:p>
+            <w:pPr>
+              <w:spacing w:after="0" w:before="0" w:line="270"/>
+            </w:pPr>
+            <w:r>
+              <w:rPr>
+                <w:sz w:val="19"/>
+                <w:szCs w:val="19"/>
+              </w:rPr>
+              <w:t xml:space="preserve">Seta cima</w:t>
+            </w:r>
+          </w:p>
+        </w:tc>
+        <w:tc>
+          <w:tcPr>
+            <w:tcW w:type="dxa" w:w="3856"/>
+            <w:tcBorders>
+              <w:top w:val="single" w:color="C9C2B8" w:sz="4"/>
+              <w:left w:val="single" w:color="C9C2B8" w:sz="4"/>
+              <w:bottom w:val="single" w:color="C9C2B8" w:sz="4"/>
+              <w:right w:val="single" w:color="C9C2B8" w:sz="4"/>
+            </w:tcBorders>
+            <w:tcMar>
+              <w:top w:type="dxa" w:w="60"/>
+              <w:left w:type="dxa" w:w="100"/>
+              <w:bottom w:type="dxa" w:w="60"/>
+              <w:right w:type="dxa" w:w="100"/>
+            </w:tcMar>
+          </w:tcPr>
+          <w:p>
+            <w:pPr>
+              <w:spacing w:after="0" w:before="0" w:line="270"/>
+            </w:pPr>
+            <w:r>
+              <w:rPr>
+                <w:sz w:val="19"/>
+                <w:szCs w:val="19"/>
+              </w:rPr>
+              <w:t xml:space="preserve">D-pad cima</w:t>
+            </w:r>
+          </w:p>
+        </w:tc>
+      </w:tr>
+      <w:tr>
+        <w:trPr>
+          <w:cantSplit/>
+        </w:trPr>
+        <w:tc>
+          <w:tcPr>
+            <w:tcW w:type="dxa" w:w="2998"/>
+            <w:tcBorders>
+              <w:top w:val="single" w:color="C9C2B8" w:sz="4"/>
+              <w:left w:val="single" w:color="C9C2B8" w:sz="4"/>
+              <w:bottom w:val="single" w:color="C9C2B8" w:sz="4"/>
+              <w:right w:val="single" w:color="C9C2B8" w:sz="4"/>
+            </w:tcBorders>
+            <w:tcMar>
+              <w:top w:type="dxa" w:w="60"/>
+              <w:left w:type="dxa" w:w="100"/>
+              <w:bottom w:type="dxa" w:w="60"/>
+              <w:right w:type="dxa" w:w="100"/>
+            </w:tcMar>
+          </w:tcPr>
+          <w:p>
+            <w:pPr>
+              <w:spacing w:after="0" w:before="0" w:line="270"/>
+            </w:pPr>
+            <w:r>
+              <w:rPr>
+                <w:rFonts w:ascii="Consolas" w:cs="Consolas" w:eastAsia="Consolas" w:hAnsi="Consolas"/>
+                <w:color w:val="7A1F2B"/>
+                <w:sz w:val="17"/>
+                <w:szCs w:val="17"/>
+              </w:rPr>
+              <w:t xml:space="preserve">mover_baixo</w:t>
+            </w:r>
+          </w:p>
+        </w:tc>
+        <w:tc>
+          <w:tcPr>
+            <w:tcW w:type="dxa" w:w="2784"/>
+            <w:tcBorders>
+              <w:top w:val="single" w:color="C9C2B8" w:sz="4"/>
+              <w:left w:val="single" w:color="C9C2B8" w:sz="4"/>
+              <w:bottom w:val="single" w:color="C9C2B8" w:sz="4"/>
+              <w:right w:val="single" w:color="C9C2B8" w:sz="4"/>
+            </w:tcBorders>
+            <w:tcMar>
+              <w:top w:type="dxa" w:w="60"/>
+              <w:left w:type="dxa" w:w="100"/>
+              <w:bottom w:type="dxa" w:w="60"/>
+              <w:right w:type="dxa" w:w="100"/>
+            </w:tcMar>
+          </w:tcPr>
+          <w:p>
+            <w:pPr>
+              <w:spacing w:after="0" w:before="0" w:line="270"/>
+            </w:pPr>
+            <w:r>
+              <w:rPr>
+                <w:sz w:val="19"/>
+                <w:szCs w:val="19"/>
+              </w:rPr>
+              <w:t xml:space="preserve">Seta baixo</w:t>
+            </w:r>
+          </w:p>
+        </w:tc>
+        <w:tc>
+          <w:tcPr>
+            <w:tcW w:type="dxa" w:w="3856"/>
+            <w:tcBorders>
+              <w:top w:val="single" w:color="C9C2B8" w:sz="4"/>
+              <w:left w:val="single" w:color="C9C2B8" w:sz="4"/>
+              <w:bottom w:val="single" w:color="C9C2B8" w:sz="4"/>
+              <w:right w:val="single" w:color="C9C2B8" w:sz="4"/>
+            </w:tcBorders>
+            <w:tcMar>
+              <w:top w:type="dxa" w:w="60"/>
+              <w:left w:type="dxa" w:w="100"/>
+              <w:bottom w:type="dxa" w:w="60"/>
+              <w:right w:type="dxa" w:w="100"/>
+            </w:tcMar>
+          </w:tcPr>
+          <w:p>
+            <w:pPr>
+              <w:spacing w:after="0" w:before="0" w:line="270"/>
+            </w:pPr>
+            <w:r>
+              <w:rPr>
+                <w:sz w:val="19"/>
+                <w:szCs w:val="19"/>
+              </w:rPr>
+              <w:t xml:space="preserve">D-pad baixo</w:t>
+            </w:r>
+          </w:p>
+        </w:tc>
+      </w:tr>
+      <w:tr>
+        <w:trPr>
+          <w:cantSplit/>
+        </w:trPr>
+        <w:tc>
+          <w:tcPr>
+            <w:tcW w:type="dxa" w:w="2998"/>
+            <w:tcBorders>
+              <w:top w:val="single" w:color="C9C2B8" w:sz="4"/>
+              <w:left w:val="single" w:color="C9C2B8" w:sz="4"/>
+              <w:bottom w:val="single" w:color="C9C2B8" w:sz="4"/>
+              <w:right w:val="single" w:color="C9C2B8" w:sz="4"/>
+            </w:tcBorders>
+            <w:tcMar>
+              <w:top w:type="dxa" w:w="60"/>
+              <w:left w:type="dxa" w:w="100"/>
+              <w:bottom w:type="dxa" w:w="60"/>
+              <w:right w:type="dxa" w:w="100"/>
+            </w:tcMar>
+          </w:tcPr>
+          <w:p>
+            <w:pPr>
+              <w:spacing w:after="0" w:before="0" w:line="270"/>
+            </w:pPr>
+            <w:r>
+              <w:rPr>
+                <w:rFonts w:ascii="Consolas" w:cs="Consolas" w:eastAsia="Consolas" w:hAnsi="Consolas"/>
+                <w:color w:val="7A1F2B"/>
+                <w:sz w:val="17"/>
+                <w:szCs w:val="17"/>
+              </w:rPr>
+              <w:t xml:space="preserve">pular</w:t>
+            </w:r>
+          </w:p>
+        </w:tc>
+        <w:tc>
+          <w:tcPr>
+            <w:tcW w:type="dxa" w:w="2784"/>
+            <w:tcBorders>
+              <w:top w:val="single" w:color="C9C2B8" w:sz="4"/>
+              <w:left w:val="single" w:color="C9C2B8" w:sz="4"/>
+              <w:bottom w:val="single" w:color="C9C2B8" w:sz="4"/>
+              <w:right w:val="single" w:color="C9C2B8" w:sz="4"/>
+            </w:tcBorders>
+            <w:tcMar>
+              <w:top w:type="dxa" w:w="60"/>
+              <w:left w:type="dxa" w:w="100"/>
+              <w:bottom w:type="dxa" w:w="60"/>
+              <w:right w:type="dxa" w:w="100"/>
+            </w:tcMar>
+          </w:tcPr>
+          <w:p>
+            <w:pPr>
+              <w:spacing w:after="0" w:before="0" w:line="270"/>
+            </w:pPr>
+            <w:r>
+              <w:rPr>
+                <w:sz w:val="19"/>
+                <w:szCs w:val="19"/>
+              </w:rPr>
+              <w:t xml:space="preserve">Espaço</w:t>
+            </w:r>
+          </w:p>
+        </w:tc>
+        <w:tc>
+          <w:tcPr>
+            <w:tcW w:type="dxa" w:w="3856"/>
+            <w:tcBorders>
+              <w:top w:val="single" w:color="C9C2B8" w:sz="4"/>
+              <w:left w:val="single" w:color="C9C2B8" w:sz="4"/>
+              <w:bottom w:val="single" w:color="C9C2B8" w:sz="4"/>
+              <w:right w:val="single" w:color="C9C2B8" w:sz="4"/>
+            </w:tcBorders>
+            <w:tcMar>
+              <w:top w:type="dxa" w:w="60"/>
+              <w:left w:type="dxa" w:w="100"/>
+              <w:bottom w:type="dxa" w:w="60"/>
+              <w:right w:type="dxa" w:w="100"/>
+            </w:tcMar>
+          </w:tcPr>
+          <w:p>
+            <w:pPr>
+              <w:spacing w:after="0" w:before="0" w:line="270"/>
+            </w:pPr>
+            <w:r>
+              <w:rPr>
+                <w:sz w:val="19"/>
+                <w:szCs w:val="19"/>
+              </w:rPr>
+              <w:t xml:space="preserve">Botão A (inferior)</w:t>
+            </w:r>
+          </w:p>
+        </w:tc>
+      </w:tr>
+      <w:tr>
+        <w:trPr>
+          <w:cantSplit/>
+        </w:trPr>
+        <w:tc>
+          <w:tcPr>
+            <w:tcW w:type="dxa" w:w="2998"/>
+            <w:tcBorders>
+              <w:top w:val="single" w:color="C9C2B8" w:sz="4"/>
+              <w:left w:val="single" w:color="C9C2B8" w:sz="4"/>
+              <w:bottom w:val="single" w:color="C9C2B8" w:sz="4"/>
+              <w:right w:val="single" w:color="C9C2B8" w:sz="4"/>
+            </w:tcBorders>
+            <w:tcMar>
+              <w:top w:type="dxa" w:w="60"/>
+              <w:left w:type="dxa" w:w="100"/>
+              <w:bottom w:type="dxa" w:w="60"/>
+              <w:right w:type="dxa" w:w="100"/>
+            </w:tcMar>
+          </w:tcPr>
+          <w:p>
+            <w:pPr>
+              <w:spacing w:after="0" w:before="0" w:line="270"/>
+            </w:pPr>
+            <w:r>
+              <w:rPr>
+                <w:rFonts w:ascii="Consolas" w:cs="Consolas" w:eastAsia="Consolas" w:hAnsi="Consolas"/>
+                <w:color w:val="7A1F2B"/>
+                <w:sz w:val="17"/>
+                <w:szCs w:val="17"/>
+              </w:rPr>
+              <w:t xml:space="preserve">dash</w:t>
+            </w:r>
+          </w:p>
+        </w:tc>
+        <w:tc>
+          <w:tcPr>
+            <w:tcW w:type="dxa" w:w="2784"/>
+            <w:tcBorders>
+              <w:top w:val="single" w:color="C9C2B8" w:sz="4"/>
+              <w:left w:val="single" w:color="C9C2B8" w:sz="4"/>
+              <w:bottom w:val="single" w:color="C9C2B8" w:sz="4"/>
+              <w:right w:val="single" w:color="C9C2B8" w:sz="4"/>
+            </w:tcBorders>
+            <w:tcMar>
+              <w:top w:type="dxa" w:w="60"/>
+              <w:left w:type="dxa" w:w="100"/>
+              <w:bottom w:type="dxa" w:w="60"/>
+              <w:right w:type="dxa" w:w="100"/>
+            </w:tcMar>
+          </w:tcPr>
+          <w:p>
+            <w:pPr>
+              <w:spacing w:after="0" w:before="0" w:line="270"/>
+            </w:pPr>
+            <w:r>
+              <w:rPr>
+                <w:sz w:val="19"/>
+                <w:szCs w:val="19"/>
+              </w:rPr>
+              <w:t xml:space="preserve">Shift</w:t>
+            </w:r>
+          </w:p>
+        </w:tc>
+        <w:tc>
+          <w:tcPr>
+            <w:tcW w:type="dxa" w:w="3856"/>
+            <w:tcBorders>
+              <w:top w:val="single" w:color="C9C2B8" w:sz="4"/>
+              <w:left w:val="single" w:color="C9C2B8" w:sz="4"/>
+              <w:bottom w:val="single" w:color="C9C2B8" w:sz="4"/>
+              <w:right w:val="single" w:color="C9C2B8" w:sz="4"/>
+            </w:tcBorders>
+            <w:tcMar>
+              <w:top w:type="dxa" w:w="60"/>
+              <w:left w:type="dxa" w:w="100"/>
+              <w:bottom w:type="dxa" w:w="60"/>
+              <w:right w:type="dxa" w:w="100"/>
+            </w:tcMar>
+          </w:tcPr>
+          <w:p>
+            <w:pPr>
+              <w:spacing w:after="0" w:before="0" w:line="270"/>
+            </w:pPr>
+            <w:r>
+              <w:rPr>
+                <w:sz w:val="19"/>
+                <w:szCs w:val="19"/>
+              </w:rPr>
+              <w:t xml:space="preserve">Botão B (direito)</w:t>
+            </w:r>
+          </w:p>
+        </w:tc>
+      </w:tr>
+      <w:tr>
+        <w:trPr>
+          <w:cantSplit/>
+        </w:trPr>
+        <w:tc>
+          <w:tcPr>
+            <w:tcW w:type="dxa" w:w="2998"/>
+            <w:tcBorders>
+              <w:top w:val="single" w:color="C9C2B8" w:sz="4"/>
+              <w:left w:val="single" w:color="C9C2B8" w:sz="4"/>
+              <w:bottom w:val="single" w:color="C9C2B8" w:sz="4"/>
+              <w:right w:val="single" w:color="C9C2B8" w:sz="4"/>
+            </w:tcBorders>
+            <w:tcMar>
+              <w:top w:type="dxa" w:w="60"/>
+              <w:left w:type="dxa" w:w="100"/>
+              <w:bottom w:type="dxa" w:w="60"/>
+              <w:right w:type="dxa" w:w="100"/>
+            </w:tcMar>
+          </w:tcPr>
+          <w:p>
+            <w:pPr>
+              <w:spacing w:after="0" w:before="0" w:line="270"/>
+            </w:pPr>
+            <w:r>
+              <w:rPr>
+                <w:rFonts w:ascii="Consolas" w:cs="Consolas" w:eastAsia="Consolas" w:hAnsi="Consolas"/>
+                <w:color w:val="7A1F2B"/>
+                <w:sz w:val="17"/>
+                <w:szCs w:val="17"/>
+              </w:rPr>
+              <w:t xml:space="preserve">arremessar</w:t>
+            </w:r>
+          </w:p>
+        </w:tc>
+        <w:tc>
+          <w:tcPr>
+            <w:tcW w:type="dxa" w:w="2784"/>
+            <w:tcBorders>
+              <w:top w:val="single" w:color="C9C2B8" w:sz="4"/>
+              <w:left w:val="single" w:color="C9C2B8" w:sz="4"/>
+              <w:bottom w:val="single" w:color="C9C2B8" w:sz="4"/>
+              <w:right w:val="single" w:color="C9C2B8" w:sz="4"/>
+            </w:tcBorders>
+            <w:tcMar>
+              <w:top w:type="dxa" w:w="60"/>
+              <w:left w:type="dxa" w:w="100"/>
+              <w:bottom w:type="dxa" w:w="60"/>
+              <w:right w:type="dxa" w:w="100"/>
+            </w:tcMar>
+          </w:tcPr>
+          <w:p>
+            <w:pPr>
+              <w:spacing w:after="0" w:before="0" w:line="270"/>
+            </w:pPr>
+            <w:r>
+              <w:rPr>
+                <w:sz w:val="19"/>
+                <w:szCs w:val="19"/>
+              </w:rPr>
+              <w:t xml:space="preserve">C</w:t>
+            </w:r>
+          </w:p>
+        </w:tc>
+        <w:tc>
+          <w:tcPr>
+            <w:tcW w:type="dxa" w:w="3856"/>
+            <w:tcBorders>
+              <w:top w:val="single" w:color="C9C2B8" w:sz="4"/>
+              <w:left w:val="single" w:color="C9C2B8" w:sz="4"/>
+              <w:bottom w:val="single" w:color="C9C2B8" w:sz="4"/>
+              <w:right w:val="single" w:color="C9C2B8" w:sz="4"/>
+            </w:tcBorders>
+            <w:tcMar>
+              <w:top w:type="dxa" w:w="60"/>
+              <w:left w:type="dxa" w:w="100"/>
+              <w:bottom w:type="dxa" w:w="60"/>
+              <w:right w:type="dxa" w:w="100"/>
+            </w:tcMar>
+          </w:tcPr>
+          <w:p>
+            <w:pPr>
+              <w:spacing w:after="0" w:before="0" w:line="270"/>
+            </w:pPr>
+            <w:r>
+              <w:rPr>
+                <w:sz w:val="19"/>
+                <w:szCs w:val="19"/>
+              </w:rPr>
+              <w:t xml:space="preserve">Botão X (esquerdo)</w:t>
+            </w:r>
+          </w:p>
+        </w:tc>
+      </w:tr>
+      <w:tr>
+        <w:trPr>
+          <w:cantSplit/>
+        </w:trPr>
+        <w:tc>
+          <w:tcPr>
+            <w:tcW w:type="dxa" w:w="2998"/>
+            <w:tcBorders>
+              <w:top w:val="single" w:color="C9C2B8" w:sz="4"/>
+              <w:left w:val="single" w:color="C9C2B8" w:sz="4"/>
+              <w:bottom w:val="single" w:color="C9C2B8" w:sz="4"/>
+              <w:right w:val="single" w:color="C9C2B8" w:sz="4"/>
+            </w:tcBorders>
+            <w:tcMar>
+              <w:top w:type="dxa" w:w="60"/>
+              <w:left w:type="dxa" w:w="100"/>
+              <w:bottom w:type="dxa" w:w="60"/>
+              <w:right w:type="dxa" w:w="100"/>
+            </w:tcMar>
+          </w:tcPr>
+          <w:p>
+            <w:pPr>
+              <w:spacing w:after="0" w:before="0" w:line="270"/>
+            </w:pPr>
+            <w:r>
+              <w:rPr>
+                <w:rFonts w:ascii="Consolas" w:cs="Consolas" w:eastAsia="Consolas" w:hAnsi="Consolas"/>
+                <w:color w:val="7A1F2B"/>
+                <w:sz w:val="17"/>
+                <w:szCs w:val="17"/>
+              </w:rPr>
+              <w:t xml:space="preserve">cortar</w:t>
+            </w:r>
+          </w:p>
+        </w:tc>
+        <w:tc>
+          <w:tcPr>
+            <w:tcW w:type="dxa" w:w="2784"/>
+            <w:tcBorders>
+              <w:top w:val="single" w:color="C9C2B8" w:sz="4"/>
+              <w:left w:val="single" w:color="C9C2B8" w:sz="4"/>
+              <w:bottom w:val="single" w:color="C9C2B8" w:sz="4"/>
+              <w:right w:val="single" w:color="C9C2B8" w:sz="4"/>
+            </w:tcBorders>
+            <w:tcMar>
+              <w:top w:type="dxa" w:w="60"/>
+              <w:left w:type="dxa" w:w="100"/>
+              <w:bottom w:type="dxa" w:w="60"/>
+              <w:right w:type="dxa" w:w="100"/>
+            </w:tcMar>
+          </w:tcPr>
+          <w:p>
+            <w:pPr>
+              <w:spacing w:after="0" w:before="0" w:line="270"/>
+            </w:pPr>
+            <w:r>
+              <w:rPr>
+                <w:sz w:val="19"/>
+                <w:szCs w:val="19"/>
+              </w:rPr>
+              <w:t xml:space="preserve">V</w:t>
+            </w:r>
+          </w:p>
+        </w:tc>
+        <w:tc>
+          <w:tcPr>
+            <w:tcW w:type="dxa" w:w="3856"/>
+            <w:tcBorders>
+              <w:top w:val="single" w:color="C9C2B8" w:sz="4"/>
+              <w:left w:val="single" w:color="C9C2B8" w:sz="4"/>
+              <w:bottom w:val="single" w:color="C9C2B8" w:sz="4"/>
+              <w:right w:val="single" w:color="C9C2B8" w:sz="4"/>
+            </w:tcBorders>
+            <w:tcMar>
+              <w:top w:type="dxa" w:w="60"/>
+              <w:left w:type="dxa" w:w="100"/>
+              <w:bottom w:type="dxa" w:w="60"/>
+              <w:right w:type="dxa" w:w="100"/>
+            </w:tcMar>
+          </w:tcPr>
+          <w:p>
+            <w:pPr>
+              <w:spacing w:after="0" w:before="0" w:line="270"/>
+            </w:pPr>
+            <w:r>
+              <w:rPr>
+                <w:sz w:val="19"/>
+                <w:szCs w:val="19"/>
+              </w:rPr>
+              <w:t xml:space="preserve">Botão Y (superior)</w:t>
+            </w:r>
+          </w:p>
+        </w:tc>
+      </w:tr>
+    </w:tbl>
+    <w:p>
+      <w:pPr>
+        <w:spacing w:after="120" w:before="0"/>
+      </w:pPr>
     </w:p>
     <w:p>
       <w:pPr>

</xml_diff>

<commit_message>
Fecha a fatia 001-movimento: resultado do playtest humano (T009)
specs/001-movimento/tasks.md: marca T009 e T010 concluídas, com o
resultado real do playtest humano — passos 1–8 de quickstart.md
confirmados, passo 9 (zona morta do analógico) não testado por
falta de controle com analógico disponível. T010 confirma sem
lacuna de nomenclatura (CS-004); as lacunas de cobertura encontradas
já foram remediadas na T011.

docs/fluxo-sdd.md: Registro da execução do Passo 8 atualizado com o
mesmo resultado do playtest. README.md: fatia 001-movimento marcada
como concluída na tabela de fatias. Apostila regenerada.

Co-Authored-By: Claude Sonnet 5 <noreply@anthropic.com>
Claude-Session: https://claude.ai/code/session_013C3C5DedTPiiK8Mx8XpXm3
</commit_message>
<xml_diff>
--- a/docs/apostila-sdd-ze-peixeira.docx
+++ b/docs/apostila-sdd-ze-peixeira.docx
@@ -1898,7 +1898,7 @@
             <w:pPr>
               <w:spacing w:after="0" w:before="0" w:line="270"/>
             </w:pPr>
-            <w:hyperlink w:history="1" r:id="rIdrlbh_oeddk8j2cicwyt8b">
+            <w:hyperlink w:history="1" r:id="rIdlwk64rk30o99noaxhzanl">
               <w:r>
                 <w:rPr>
                   <w:rStyle w:val="Hyperlink"/>
@@ -2308,7 +2308,7 @@
               </w:rPr>
               <w:t xml:space="preserve">Servidor MCP para Godot (ex.: </w:t>
             </w:r>
-            <w:hyperlink w:history="1" r:id="rIdl1bekmdqfsazugrqpphjn">
+            <w:hyperlink w:history="1" r:id="rId4czxu9jpi7n0xtpxozp2h">
               <w:r>
                 <w:rPr>
                   <w:rStyle w:val="Hyperlink"/>
@@ -4645,7 +4645,7 @@
           <w:sz w:val="20"/>
           <w:szCs w:val="20"/>
         </w:rPr>
-        <w:t xml:space="preserve"> (RF-006/RF-008) não tem teste de integração próprio, só a regra pura e o método </w:t>
+        <w:t xml:space="preserve"> (RF-006/RF-008) não tinha teste de integração próprio, só a regra pura e o método </w:t>
       </w:r>
       <w:r>
         <w:rPr>
@@ -4693,7 +4693,7 @@
           <w:sz w:val="20"/>
           <w:szCs w:val="20"/>
         </w:rPr>
-        <w:t xml:space="preserve"> (Phase 5: Convergence), ainda não implementada. Playtest formal (os 9 passos de </w:t>
+        <w:t xml:space="preserve"> (Phase 5: Convergence) e depois implementada (o primeiro teste escrito para ela também foi corrigido numa revisão, por ser vazio: </w:t>
       </w:r>
       <w:r>
         <w:rPr>
@@ -4702,14 +4702,30 @@
           <w:sz w:val="18"/>
           <w:szCs w:val="18"/>
         </w:rPr>
-        <w:t xml:space="preserve">quickstart.md</w:t>
+        <w:t xml:space="preserve">docs/review/001-T011-teste-vazio-integracao.md</w:t>
       </w:r>
       <w:r>
         <w:rPr>
           <w:sz w:val="20"/>
           <w:szCs w:val="20"/>
         </w:rPr>
-        <w:t xml:space="preserve">) entregue como checklist para o humano executar, não marcado como feito pelo agente. Testes automatizados: </w:t>
+        <w:t xml:space="preserve">). </w:t>
+      </w:r>
+      <w:r>
+        <w:rPr>
+          <w:b/>
+          <w:bCs/>
+          <w:sz w:val="20"/>
+          <w:szCs w:val="20"/>
+        </w:rPr>
+        <w:t xml:space="preserve">Resultado do playtest humano da T009 (2026-09-22):</w:t>
+      </w:r>
+      <w:r>
+        <w:rPr>
+          <w:sz w:val="20"/>
+          <w:szCs w:val="20"/>
+        </w:rPr>
+        <w:t xml:space="preserve"> passos 1–8 dos 9 de </w:t>
       </w:r>
       <w:r>
         <w:rPr>
@@ -4718,14 +4734,62 @@
           <w:sz w:val="18"/>
           <w:szCs w:val="18"/>
         </w:rPr>
-        <w:t xml:space="preserve">16/16 passed</w:t>
+        <w:t xml:space="preserve">quickstart.md</w:t>
       </w:r>
       <w:r>
         <w:rPr>
           <w:sz w:val="20"/>
           <w:szCs w:val="20"/>
         </w:rPr>
-        <w:t xml:space="preserve"> (15 de RF/CS + 1 de ambiente). Não há fatia anterior a esta (é a primeira da demonstração), então a constituição 4.4 ("testes de fatias anteriores continuam passando") ainda não teve chance de ser exercida.</w:t>
+        <w:t xml:space="preserve"> confirmados, jogando </w:t>
+      </w:r>
+      <w:r>
+        <w:rPr>
+          <w:rFonts w:ascii="Consolas" w:cs="Consolas" w:eastAsia="Consolas" w:hAnsi="Consolas"/>
+          <w:color w:val="7A1F2B"/>
+          <w:sz w:val="18"/>
+          <w:szCs w:val="18"/>
+        </w:rPr>
+        <w:t xml:space="preserve">fase_teste.tscn</w:t>
+      </w:r>
+      <w:r>
+        <w:rPr>
+          <w:sz w:val="20"/>
+          <w:szCs w:val="20"/>
+        </w:rPr>
+        <w:t xml:space="preserve"> no editor. Passo 9 (zona morta do analógico, RF-001) </w:t>
+      </w:r>
+      <w:r>
+        <w:rPr>
+          <w:b/>
+          <w:bCs/>
+          <w:sz w:val="20"/>
+          <w:szCs w:val="20"/>
+        </w:rPr>
+        <w:t xml:space="preserve">não testado</w:t>
+      </w:r>
+      <w:r>
+        <w:rPr>
+          <w:sz w:val="20"/>
+          <w:szCs w:val="20"/>
+        </w:rPr>
+        <w:t xml:space="preserve"> — sem controle com analógico disponível no momento do playtest. Testes automatizados: </w:t>
+      </w:r>
+      <w:r>
+        <w:rPr>
+          <w:rFonts w:ascii="Consolas" w:cs="Consolas" w:eastAsia="Consolas" w:hAnsi="Consolas"/>
+          <w:color w:val="7A1F2B"/>
+          <w:sz w:val="18"/>
+          <w:szCs w:val="18"/>
+        </w:rPr>
+        <w:t xml:space="preserve">18/18 passed</w:t>
+      </w:r>
+      <w:r>
+        <w:rPr>
+          <w:sz w:val="20"/>
+          <w:szCs w:val="20"/>
+        </w:rPr>
+        <w:t xml:space="preserve"> (17 de RF/CS/integração + 1 de ambiente). Não há fatia anterior a esta (é a primeira da demonstração), então a constituição 4.4 ("testes de fatias anteriores continuam passando") ainda não teve chance de ser exercida.</w:t>
       </w:r>
     </w:p>
     <w:p>

</xml_diff>

<commit_message>
Material da aula: requisitos da fatia 001, seis registros no fluxo, RF-007 da 004 reseta o olhar
Co-Authored-By: Claude Sonnet 5 <noreply@anthropic.com>
</commit_message>
<xml_diff>
--- a/docs/apostila-sdd-ze-peixeira.docx
+++ b/docs/apostila-sdd-ze-peixeira.docx
@@ -1898,7 +1898,7 @@
             <w:pPr>
               <w:spacing w:after="0" w:before="0" w:line="270"/>
             </w:pPr>
-            <w:hyperlink w:history="1" r:id="rIdlwk64rk30o99noaxhzanl">
+            <w:hyperlink w:history="1" r:id="rIdl1f5ibs_alx8ldseaity7">
               <w:r>
                 <w:rPr>
                   <w:rStyle w:val="Hyperlink"/>
@@ -2308,7 +2308,7 @@
               </w:rPr>
               <w:t xml:space="preserve">Servidor MCP para Godot (ex.: </w:t>
             </w:r>
-            <w:hyperlink w:history="1" r:id="rId4czxu9jpi7n0xtpxozp2h">
+            <w:hyperlink w:history="1" r:id="rIdpt2q1tgdywkkdyxoyc9z8">
               <w:r>
                 <w:rPr>
                   <w:rStyle w:val="Hyperlink"/>
@@ -4366,7 +4366,7 @@
           <w:sz w:val="20"/>
           <w:szCs w:val="20"/>
         </w:rPr>
-        <w:t xml:space="preserve"> Cinco registros criados nesta fatia: </w:t>
+        <w:t xml:space="preserve"> Seis registros criados nesta fatia: </w:t>
       </w:r>
       <w:r>
         <w:rPr>
@@ -4478,7 +4478,23 @@
           <w:sz w:val="20"/>
           <w:szCs w:val="20"/>
         </w:rPr>
-        <w:t xml:space="preserve"> (um teste do agente não exercitava de fato o comportamento que deveria cobrir).</w:t>
+        <w:t xml:space="preserve"> (um teste do agente não exercitava de fato o comportamento que deveria cobrir); </w:t>
+      </w:r>
+      <w:r>
+        <w:rPr>
+          <w:rFonts w:ascii="Consolas" w:cs="Consolas" w:eastAsia="Consolas" w:hAnsi="Consolas"/>
+          <w:color w:val="7A1F2B"/>
+          <w:sz w:val="18"/>
+          <w:szCs w:val="18"/>
+        </w:rPr>
+        <w:t xml:space="preserve">docs/review/001-T011-teste-vazio-integracao.md</w:t>
+      </w:r>
+      <w:r>
+        <w:rPr>
+          <w:sz w:val="20"/>
+          <w:szCs w:val="20"/>
+        </w:rPr>
+        <w:t xml:space="preserve"> (o teste de integração passava sem a fase chamar o reaparecimento).</w:t>
       </w:r>
     </w:p>
     <w:p>

</xml_diff>